<commit_message>
atualizações de acordo com o documento da aula
</commit_message>
<xml_diff>
--- a/DOCUMENTOS/Relatorio_Sistema_Clinica_Equipe.docx
+++ b/DOCUMENTOS/Relatorio_Sistema_Clinica_Equipe.docx
@@ -286,15 +286,14 @@
     </w:p>
     <w:p>
       <w:r>
-        <w:t>Incluído: cadastro e busca de pacientes e profissionais; agendamento, alteração, cancelamento e busca de consultas; prevenção de conflito de horários para o mesmo profissional; histórico de consultas.</w:t>
-      </w:r>
-    </w:p>
-    <w:p>
-      <w:r>
-        <w:rPr>
-          <w:highlight w:val="yellow"/>
-        </w:rPr>
-        <w:t>Fora do escopo: prontuário eletrônico, faturamento e convênios, controle de acesso por login e envio de lembretes aos pacientes.</w:t>
+        <w:rPr/>
+        <w:t>Incluído: cadastro e busca de pacientes e profissionais; agendamento, alteração, cancelamento e busca de consultas; prevenção de conflito de horários para o mesmo profissional; histórico de consultas; tela de login com usuário e senha (incluída depois da Etapa 1).</w:t>
+      </w:r>
+    </w:p>
+    <w:p>
+      <w:r>
+        <w:rPr/>
+        <w:t>Fora do escopo: prontuário eletrônico, faturamento e convênios, perfis de acesso com permissões diferentes por usuário, tela para cadastrar usuários (novos usuários são criados por comando, ver seção 13) e envio de lembretes aos pacientes.</w:t>
       </w:r>
     </w:p>
     <w:p>
@@ -343,15 +342,20 @@
     </w:p>
     <w:p>
       <w:r>
-        <w:t xml:space="preserve">Interface Gráfica: </w:t>
-      </w:r>
-      <w:proofErr w:type="spellStart"/>
-      <w:r>
-        <w:t>Tkinter</w:t>
-      </w:r>
-      <w:proofErr w:type="spellEnd"/>
-      <w:r>
-        <w:t xml:space="preserve"> (biblioteca padrão do Python, dispensa instalação adicional e permite criar a interface desktop rapidamente).</w:t>
+        <w:rPr/>
+        <w:t>Interface Gráfica: CustomTkinter, biblioteca baseada no Tkinter que oferece visual moderno (cartões, menu lateral, modo claro e escuro). É a única dependência externa e é instalada com pip. A interface foi feita primeiro em Tkinter e depois migrada para o CustomTkinter.</w:t>
+      </w:r>
+    </w:p>
+    <w:p>
+      <w:r>
+        <w:rPr/>
+        <w:t>Autenticação: a senha de login é guardada apenas como hash PBKDF2 com salt aleatório, usando os módulos hashlib e hmac da biblioteca padrão.</w:t>
+      </w:r>
+    </w:p>
+    <w:p>
+      <w:r>
+        <w:rPr/>
+        <w:t>Testes: módulo unittest da biblioteca padrão (python -m unittest discover -s tests -v).</w:t>
       </w:r>
     </w:p>
     <w:p>
@@ -364,246 +368,118 @@
     </w:p>
     <w:p>
       <w:r>
-        <w:t>Tabela: Pacientes</w:t>
-      </w:r>
-      <w:r>
-        <w:br/>
-        <w:t xml:space="preserve">- </w:t>
-      </w:r>
-      <w:proofErr w:type="spellStart"/>
-      <w:r>
-        <w:t>id_paciente</w:t>
-      </w:r>
-      <w:proofErr w:type="spellEnd"/>
-      <w:r>
-        <w:t xml:space="preserve"> (Chave Primária, Inteiro, Auto incremento)</w:t>
-      </w:r>
-      <w:r>
-        <w:br/>
-      </w:r>
-      <w:r>
-        <w:lastRenderedPageBreak/>
+        <w:rPr/>
+        <w:t>Tabela: paciente</w:t>
+        <w:br/>
+        <w:t>- id (Chave Primária, Inteiro, Auto incremento)</w:t>
+        <w:br/>
         <w:t>- nome (Texto, Obrigatório)</w:t>
-      </w:r>
-      <w:r>
-        <w:br/>
-        <w:t xml:space="preserve">- </w:t>
-      </w:r>
-      <w:proofErr w:type="spellStart"/>
-      <w:r>
-        <w:t>cpf</w:t>
-      </w:r>
-      <w:proofErr w:type="spellEnd"/>
-      <w:r>
-        <w:t xml:space="preserve"> (Texto, Único, Obrigatório)</w:t>
-      </w:r>
-      <w:r>
-        <w:br/>
-        <w:t>- telefone (Texto)</w:t>
-      </w:r>
-      <w:r>
-        <w:br/>
-        <w:t xml:space="preserve">- </w:t>
-      </w:r>
-      <w:proofErr w:type="spellStart"/>
-      <w:r>
-        <w:t>data_nascimento</w:t>
-      </w:r>
-      <w:proofErr w:type="spellEnd"/>
-      <w:r>
-        <w:t xml:space="preserve"> (Data)</w:t>
-      </w:r>
-    </w:p>
-    <w:p>
-      <w:r>
-        <w:t>Tabela: Profissionais</w:t>
-      </w:r>
-      <w:r>
-        <w:br/>
-        <w:t xml:space="preserve">- </w:t>
-      </w:r>
-      <w:proofErr w:type="spellStart"/>
-      <w:r>
-        <w:t>id_profissional</w:t>
-      </w:r>
-      <w:proofErr w:type="spellEnd"/>
-      <w:r>
-        <w:t xml:space="preserve"> (Chave Primária, Inteiro, Auto incremento)</w:t>
-      </w:r>
-      <w:r>
+        <w:br/>
+        <w:t>- cpf (Texto, Único, Obrigatório - somente os 11 números)</w:t>
+        <w:br/>
+        <w:t>- data_nascimento (Texto no formato AAAA-MM-DD, Obrigatório)</w:t>
+        <w:br/>
+        <w:t>- telefone (Texto, somente números)</w:t>
+        <w:br/>
+        <w:t>- email (Texto)</w:t>
+      </w:r>
+    </w:p>
+    <w:p>
+      <w:r>
+        <w:rPr/>
+        <w:t>Tabela: profissional</w:t>
+        <w:br/>
+        <w:t>- id (Chave Primária, Inteiro, Auto incremento)</w:t>
         <w:br/>
         <w:t>- nome (Texto, Obrigatório)</w:t>
-      </w:r>
-      <w:r>
-        <w:br/>
-        <w:t>- especialidade (Texto, Obrigatório)</w:t>
-      </w:r>
-      <w:r>
-        <w:br/>
-        <w:t xml:space="preserve">- </w:t>
-      </w:r>
-      <w:proofErr w:type="spellStart"/>
-      <w:r>
-        <w:t>registro_profissional</w:t>
-      </w:r>
-      <w:proofErr w:type="spellEnd"/>
-      <w:r>
-        <w:t xml:space="preserve"> (Texto, Único, Obrigatório - número do conselho, como CRM ou CREFITO)</w:t>
-      </w:r>
-    </w:p>
-    <w:p>
-      <w:r>
-        <w:t>Tabela: Consultas</w:t>
-      </w:r>
-      <w:r>
-        <w:br/>
-        <w:t xml:space="preserve">- </w:t>
-      </w:r>
-      <w:proofErr w:type="spellStart"/>
-      <w:r>
-        <w:t>id_consulta</w:t>
-      </w:r>
-      <w:proofErr w:type="spellEnd"/>
-      <w:r>
-        <w:t xml:space="preserve"> (Chave Primária, Inteiro, Auto incremento)</w:t>
-      </w:r>
-      <w:r>
-        <w:br/>
-        <w:t xml:space="preserve">- </w:t>
-      </w:r>
-      <w:proofErr w:type="spellStart"/>
-      <w:r>
-        <w:t>id_paciente</w:t>
-      </w:r>
-      <w:proofErr w:type="spellEnd"/>
-      <w:r>
-        <w:t xml:space="preserve"> (Chave Estrangeira -&gt; </w:t>
-      </w:r>
-      <w:proofErr w:type="spellStart"/>
-      <w:r>
-        <w:t>Pacientes.id_paciente</w:t>
-      </w:r>
-      <w:proofErr w:type="spellEnd"/>
-      <w:r>
-        <w:t>, Obrigatório)</w:t>
-      </w:r>
-      <w:r>
-        <w:br/>
-        <w:t xml:space="preserve">- </w:t>
-      </w:r>
-      <w:proofErr w:type="spellStart"/>
-      <w:r>
-        <w:t>id_profissional</w:t>
-      </w:r>
-      <w:proofErr w:type="spellEnd"/>
-      <w:r>
-        <w:t xml:space="preserve"> (Chave Estrangeira -&gt; </w:t>
-      </w:r>
-      <w:proofErr w:type="spellStart"/>
-      <w:r>
-        <w:t>Profissionais.id_profissional</w:t>
-      </w:r>
-      <w:proofErr w:type="spellEnd"/>
-      <w:r>
-        <w:t>, Obrigatório)</w:t>
-      </w:r>
-      <w:r>
-        <w:br/>
-        <w:t xml:space="preserve">- </w:t>
-      </w:r>
-      <w:proofErr w:type="spellStart"/>
-      <w:r>
-        <w:t>data_consulta</w:t>
-      </w:r>
-      <w:proofErr w:type="spellEnd"/>
-      <w:r>
-        <w:t xml:space="preserve"> (Data, Obrigatório)</w:t>
-      </w:r>
-      <w:r>
-        <w:br/>
-        <w:t xml:space="preserve">- </w:t>
-      </w:r>
-      <w:proofErr w:type="spellStart"/>
-      <w:r>
-        <w:t>hora_consulta</w:t>
-      </w:r>
-      <w:proofErr w:type="spellEnd"/>
-      <w:r>
-        <w:t xml:space="preserve"> (Hora, Obrigatório)</w:t>
-      </w:r>
-      <w:r>
-        <w:br/>
-        <w:t xml:space="preserve">- </w:t>
-      </w:r>
-      <w:proofErr w:type="spellStart"/>
-      <w:r>
-        <w:t>situacao</w:t>
-      </w:r>
-      <w:proofErr w:type="spellEnd"/>
-      <w:r>
-        <w:t xml:space="preserve"> (Texto, Obrigatório - 'Agendada', 'Realizada' ou 'Cancelada'; padrão 'Agendada')</w:t>
-      </w:r>
-    </w:p>
-    <w:p>
-      <w:r>
+        <w:br/>
+        <w:t>- registro (Texto, Único, Obrigatório - número do conselho, como CRM ou CREFITO)</w:t>
+        <w:br/>
+        <w:t>- especialidade_id (Chave Estrangeira -&gt; especialidade.id, Obrigatório)</w:t>
+        <w:br/>
+        <w:t>- telefone (Texto, somente números)</w:t>
+        <w:br/>
+        <w:t>- ativo (Inteiro, 0 ou 1, padrão 1 - profissional inativo não recebe novos agendamentos)</w:t>
+      </w:r>
+    </w:p>
+    <w:p>
+      <w:pPr/>
+      <w:r>
+        <w:rPr/>
+        <w:t>Tabela: especialidade</w:t>
+        <w:br/>
+        <w:t>- id (Chave Primária, Inteiro, Auto incremento)</w:t>
+        <w:br/>
+        <w:t>- nome (Texto, Único, Obrigatório - já vem com Clínica Geral, Pediatria, Cardiologia, Dermatologia e Ortopedia; novas podem ser digitadas no cadastro do profissional)</w:t>
+      </w:r>
+    </w:p>
+    <w:p>
+      <w:r>
+        <w:rPr/>
+        <w:t>Tabela: consulta</w:t>
+        <w:br/>
+        <w:t>- id (Chave Primária, Inteiro, Auto incremento)</w:t>
+        <w:br/>
+        <w:t>- paciente_id (Chave Estrangeira -&gt; paciente.id, Obrigatório)</w:t>
+        <w:br/>
+        <w:t>- profissional_id (Chave Estrangeira -&gt; profissional.id, Obrigatório)</w:t>
+        <w:br/>
+        <w:t>- data (Texto no formato AAAA-MM-DD, Obrigatório)</w:t>
+        <w:br/>
+        <w:t>- hora_inicio (Texto no formato HH:MM, Obrigatório)</w:t>
+        <w:br/>
+        <w:t>- hora_fim (Texto no formato HH:MM, Obrigatório - calculada como início + 30 minutos)</w:t>
+        <w:br/>
+        <w:t>- situacao (Texto, Obrigatório - 'Agendada', 'Realizada' ou 'Cancelada'; padrão 'Agendada')</w:t>
+        <w:br/>
+        <w:t>- motivo_cancelamento (Texto, opcional)</w:t>
+        <w:br/>
+        <w:t>- observacoes (Texto, opcional)</w:t>
+      </w:r>
+    </w:p>
+    <w:p>
+      <w:pPr/>
+      <w:r>
+        <w:rPr/>
+        <w:t>Tabela: usuario</w:t>
+        <w:br/>
+        <w:t>- id (Chave Primária, Inteiro, Auto incremento)</w:t>
+        <w:br/>
+        <w:t>- nome (Texto, Obrigatório)</w:t>
+        <w:br/>
+        <w:t>- login (Texto, Único, Obrigatório - sem diferenciar maiúsculas de minúsculas)</w:t>
+        <w:br/>
+        <w:t>- senha_hash (Texto, Obrigatório - salt e hash PBKDF2; a senha em si nunca é guardada)</w:t>
+        <w:br/>
+        <w:t>- ativo (Inteiro, 0 ou 1, padrão 1)</w:t>
+      </w:r>
+    </w:p>
+    <w:p>
+      <w:r>
+        <w:rPr/>
         <w:t>Relacionamentos:</w:t>
-      </w:r>
-      <w:r>
         <w:br/>
         <w:t>- Um paciente pode ter várias consultas (1:N).</w:t>
-      </w:r>
-      <w:r>
         <w:br/>
         <w:t>- Um profissional pode ter várias consultas (1:N).</w:t>
-      </w:r>
-    </w:p>
-    <w:p>
-      <w:r>
-        <w:t>Restrições previstas:</w:t>
-      </w:r>
-      <w:r>
-        <w:br/>
-        <w:t>- Índice único em Consultas (</w:t>
-      </w:r>
-      <w:proofErr w:type="spellStart"/>
-      <w:r>
-        <w:t>id_profissional</w:t>
-      </w:r>
-      <w:proofErr w:type="spellEnd"/>
-      <w:r>
-        <w:t xml:space="preserve">, </w:t>
-      </w:r>
-      <w:proofErr w:type="spellStart"/>
-      <w:r>
-        <w:t>data_consulta</w:t>
-      </w:r>
-      <w:proofErr w:type="spellEnd"/>
-      <w:r>
-        <w:t xml:space="preserve">, </w:t>
-      </w:r>
-      <w:proofErr w:type="spellStart"/>
-      <w:r>
-        <w:t>hora_consulta</w:t>
-      </w:r>
-      <w:proofErr w:type="spellEnd"/>
-      <w:r>
-        <w:t>) apenas para consultas não canceladas, garantindo a RN01.</w:t>
-      </w:r>
-      <w:r>
-        <w:br/>
-        <w:t>- Chaves estrangeiras sem exclusão em cascata, garantindo a RN04.</w:t>
-      </w:r>
-      <w:r>
-        <w:br/>
-        <w:t xml:space="preserve">- Verificação (CHECK) para que </w:t>
-      </w:r>
-      <w:proofErr w:type="spellStart"/>
-      <w:r>
-        <w:t>situacao</w:t>
-      </w:r>
-      <w:proofErr w:type="spellEnd"/>
-      <w:r>
-        <w:t xml:space="preserve"> aceite somente os valores previstos.</w:t>
+        <w:br/>
+        <w:t>- Uma especialidade pode ter vários profissionais (1:N).</w:t>
+        <w:br/>
+        <w:t>- A tabela usuario não se relaciona com as demais: guarda apenas os logins do sistema.</w:t>
+      </w:r>
+    </w:p>
+    <w:p>
+      <w:r>
+        <w:rPr/>
+        <w:t>Restrições implementadas:</w:t>
+        <w:br/>
+        <w:t>- Índice único parcial em consulta (profissional_id, data, hora_inicio) para consultas com situação diferente de 'Cancelada', garantindo a RN01 no próprio banco (o sistema também confere antes de gravar, para mostrar uma mensagem clara).</w:t>
+        <w:br/>
+        <w:t>- Chaves estrangeiras ativadas e sem exclusão em cascata, garantindo a RN04.</w:t>
+        <w:br/>
+        <w:t>- Valores únicos: paciente.cpf, profissional.registro, especialidade.nome e usuario.login (RN06).</w:t>
+        <w:br/>
+        <w:t>- Verificação (CHECK) para que consulta.situacao aceite somente os valores previstos e para que ativo seja 0 ou 1.</w:t>
       </w:r>
     </w:p>
     <w:p>
@@ -618,7 +494,7 @@
         <w:lastRenderedPageBreak/>
         <w:drawing>
           <wp:inline distT="0" distB="0" distL="0" distR="0" wp14:anchorId="49C9E3E3" wp14:editId="613856BA">
-            <wp:extent cx="5212080" cy="3061536"/>
+            <wp:extent cx="5486400" cy="3643586"/>
             <wp:effectExtent l="0" t="0" r="0" b="0"/>
             <wp:docPr id="101" name="Diagrama do banco de dados" descr="Diagrama entidade-relacionamento com as tabelas Pacientes, Profissionais e Consultas"/>
             <wp:cNvGraphicFramePr>
@@ -640,7 +516,7 @@
                   <pic:spPr>
                     <a:xfrm>
                       <a:off x="0" y="0"/>
-                      <a:ext cx="5212080" cy="3061536"/>
+                      <a:ext cx="5486400" cy="3643586"/>
                     </a:xfrm>
                     <a:prstGeom prst="rect">
                       <a:avLst/>
@@ -661,7 +537,7 @@
         <w:rPr>
           <w:i/>
         </w:rPr>
-        <w:t>Figura 1 - Diagrama entidade-relacionamento do banco de dados.</w:t>
+        <w:t>Figura 1 - Diagrama entidade-relacionamento do banco de dados (versão atual).</w:t>
       </w:r>
     </w:p>
     <w:p>
@@ -674,23 +550,305 @@
     </w:p>
     <w:p>
       <w:r>
+        <w:rPr/>
+        <w:t>As telas abaixo foram capturadas do sistema em funcionamento, com dados fictícios. A navegação é feita pelo menu lateral (Pacientes, Profissionais e Consultas); o botão Sair volta ao login e a chave "Modo escuro" alterna entre o tema claro e o escuro.</w:t>
+      </w:r>
+    </w:p>
+    <w:p>
+      <w:pPr>
+        <w:pStyle w:val="Ttulo3"/>
+      </w:pPr>
+      <w:r>
+        <w:rPr/>
+        <w:t>Tela de login</w:t>
+      </w:r>
+    </w:p>
+    <w:p>
+      <w:r>
+        <w:rPr/>
+        <w:t>Informe o usuário e a senha e clique em Entrar (ou tecle Enter). No primeiro uso, o usuário criado automaticamente é admin, com a senha admin123. A senha pode ser exibida marcando "Mostrar senha". Depois de 5 tentativas incorretas, o programa é encerrado.</w:t>
+      </w:r>
+    </w:p>
+    <w:p>
+      <w:pPr>
+        <w:keepNext/>
+        <w:jc w:val="center"/>
+      </w:pPr>
+      <w:r>
+        <w:drawing>
+          <wp:inline xmlns:a="http://schemas.openxmlformats.org/drawingml/2006/main" xmlns:pic="http://schemas.openxmlformats.org/drawingml/2006/picture">
+            <wp:extent cx="2468880" cy="3188970"/>
+            <wp:docPr id="102" name="Picture 102"/>
+            <wp:cNvGraphicFramePr>
+              <a:graphicFrameLocks noChangeAspect="1"/>
+            </wp:cNvGraphicFramePr>
+            <a:graphic>
+              <a:graphicData uri="http://schemas.openxmlformats.org/drawingml/2006/picture">
+                <pic:pic>
+                  <pic:nvPicPr>
+                    <pic:cNvPr id="0" name="01_login.png"/>
+                    <pic:cNvPicPr/>
+                  </pic:nvPicPr>
+                  <pic:blipFill>
+                    <a:blip r:embed="rId7"/>
+                    <a:stretch>
+                      <a:fillRect/>
+                    </a:stretch>
+                  </pic:blipFill>
+                  <pic:spPr>
+                    <a:xfrm>
+                      <a:off x="0" y="0"/>
+                      <a:ext cx="2468880" cy="3188970"/>
+                    </a:xfrm>
+                    <a:prstGeom prst="rect"/>
+                  </pic:spPr>
+                </pic:pic>
+              </a:graphicData>
+            </a:graphic>
+          </wp:inline>
+        </w:drawing>
+      </w:r>
+    </w:p>
+    <w:p>
+      <w:pPr>
+        <w:jc w:val="center"/>
+      </w:pPr>
+      <w:r>
+        <w:rPr>
+          <w:i/>
+        </w:rPr>
+        <w:t>Figura 2 - Tela de login.</w:t>
+      </w:r>
+    </w:p>
+    <w:p>
+      <w:pPr>
+        <w:pStyle w:val="Ttulo3"/>
+      </w:pPr>
+      <w:r>
+        <w:rPr/>
+        <w:t>Tela de pacientes</w:t>
+      </w:r>
+    </w:p>
+    <w:p>
+      <w:r>
+        <w:rPr/>
+        <w:t>Cadastrar: preencha Nome, CPF (11 números), Nascimento (DD/MM/AAAA; as barras entram sozinhas), Telefone com DDD (opcional) e E-mail (opcional) e clique em Cadastrar. Buscar: digite parte do nome ou o CPF e clique em Buscar; "Mostrar todos" limpa a busca. Alterar: clique na linha desejada, edite os campos e clique em Salvar alterações. Excluir: selecione o paciente e clique em Excluir; o sistema pede confirmação e bloqueia a exclusão se houver consultas vinculadas.</w:t>
+      </w:r>
+    </w:p>
+    <w:p>
+      <w:pPr>
+        <w:keepNext/>
+        <w:jc w:val="center"/>
+      </w:pPr>
+      <w:r>
+        <w:drawing>
+          <wp:inline xmlns:a="http://schemas.openxmlformats.org/drawingml/2006/main" xmlns:pic="http://schemas.openxmlformats.org/drawingml/2006/picture">
+            <wp:extent cx="5120640" cy="3298039"/>
+            <wp:docPr id="103" name="Picture 103"/>
+            <wp:cNvGraphicFramePr>
+              <a:graphicFrameLocks noChangeAspect="1"/>
+            </wp:cNvGraphicFramePr>
+            <a:graphic>
+              <a:graphicData uri="http://schemas.openxmlformats.org/drawingml/2006/picture">
+                <pic:pic>
+                  <pic:nvPicPr>
+                    <pic:cNvPr id="0" name="02_pacientes.png"/>
+                    <pic:cNvPicPr/>
+                  </pic:nvPicPr>
+                  <pic:blipFill>
+                    <a:blip r:embed="rId8"/>
+                    <a:stretch>
+                      <a:fillRect/>
+                    </a:stretch>
+                  </pic:blipFill>
+                  <pic:spPr>
+                    <a:xfrm>
+                      <a:off x="0" y="0"/>
+                      <a:ext cx="5120640" cy="3298039"/>
+                    </a:xfrm>
+                    <a:prstGeom prst="rect"/>
+                  </pic:spPr>
+                </pic:pic>
+              </a:graphicData>
+            </a:graphic>
+          </wp:inline>
+        </w:drawing>
+      </w:r>
+    </w:p>
+    <w:p>
+      <w:pPr>
+        <w:jc w:val="center"/>
+      </w:pPr>
+      <w:r>
+        <w:rPr>
+          <w:i/>
+        </w:rPr>
+        <w:t>Figura 3 - Tela de pacientes (dados fictícios).</w:t>
+      </w:r>
+    </w:p>
+    <w:p>
+      <w:pPr>
+        <w:pStyle w:val="Ttulo3"/>
+      </w:pPr>
+      <w:r>
+        <w:rPr/>
+        <w:t>Tela de profissionais</w:t>
+      </w:r>
+    </w:p>
+    <w:p>
+      <w:r>
+        <w:rPr/>
+        <w:t>Cadastrar: informe Nome, Registro profissional (CRM, CREFITO etc.), Especialidade (escolhida na lista ou digitada, caso seja nova) e Telefone (opcional) e clique em Cadastrar. Buscar: por nome ou especialidade. Alterar: selecione a linha, edite e salve. Inativar/Ativar: profissionais inativos não recebem novos agendamentos, mas mantêm o histórico. Excluir: só é permitido se o profissional não tiver consultas; se tiver, use Inativar.</w:t>
+      </w:r>
+    </w:p>
+    <w:p>
+      <w:pPr>
+        <w:keepNext/>
+        <w:jc w:val="center"/>
+      </w:pPr>
+      <w:r>
+        <w:drawing>
+          <wp:inline xmlns:a="http://schemas.openxmlformats.org/drawingml/2006/main" xmlns:pic="http://schemas.openxmlformats.org/drawingml/2006/picture">
+            <wp:extent cx="5120640" cy="3298039"/>
+            <wp:docPr id="104" name="Picture 104"/>
+            <wp:cNvGraphicFramePr>
+              <a:graphicFrameLocks noChangeAspect="1"/>
+            </wp:cNvGraphicFramePr>
+            <a:graphic>
+              <a:graphicData uri="http://schemas.openxmlformats.org/drawingml/2006/picture">
+                <pic:pic>
+                  <pic:nvPicPr>
+                    <pic:cNvPr id="0" name="04_profissionais.png"/>
+                    <pic:cNvPicPr/>
+                  </pic:nvPicPr>
+                  <pic:blipFill>
+                    <a:blip r:embed="rId9"/>
+                    <a:stretch>
+                      <a:fillRect/>
+                    </a:stretch>
+                  </pic:blipFill>
+                  <pic:spPr>
+                    <a:xfrm>
+                      <a:off x="0" y="0"/>
+                      <a:ext cx="5120640" cy="3298039"/>
+                    </a:xfrm>
+                    <a:prstGeom prst="rect"/>
+                  </pic:spPr>
+                </pic:pic>
+              </a:graphicData>
+            </a:graphic>
+          </wp:inline>
+        </w:drawing>
+      </w:r>
+    </w:p>
+    <w:p>
+      <w:pPr>
+        <w:jc w:val="center"/>
+      </w:pPr>
+      <w:r>
+        <w:rPr>
+          <w:i/>
+        </w:rPr>
+        <w:t>Figura 4 - Tela de profissionais, com um profissional inativo (dados fictícios).</w:t>
+      </w:r>
+    </w:p>
+    <w:p>
+      <w:pPr>
+        <w:pStyle w:val="Ttulo3"/>
+      </w:pPr>
+      <w:r>
+        <w:rPr/>
+        <w:t>Tela de consultas</w:t>
+      </w:r>
+    </w:p>
+    <w:p>
+      <w:r>
+        <w:rPr/>
+        <w:t>Agendar: escolha o Paciente e o Profissional nas listas, informe a Data (DD/MM/AAAA) e o Horário (HH:MM; cada consulta dura 30 minutos) e, se quiser, Observações; clique em Agendar. Remarcar: selecione a consulta na tabela, altere os dados e clique em Salvar alterações. "Marcar como realizada" e "Cancelar consulta" ficam disponíveis ao selecionar uma consulta agendada; o cancelamento pede confirmação e um motivo opcional, libera o horário e mantém a consulta no histórico. Filtrar e buscar: use a lista Situação e o campo de busca (nome do paciente, do profissional, especialidade, observações ou uma data DD/MM/AAAA).</w:t>
+      </w:r>
+    </w:p>
+    <w:p>
+      <w:pPr>
+        <w:keepNext/>
+        <w:jc w:val="center"/>
+      </w:pPr>
+      <w:r>
+        <w:drawing>
+          <wp:inline xmlns:a="http://schemas.openxmlformats.org/drawingml/2006/main" xmlns:pic="http://schemas.openxmlformats.org/drawingml/2006/picture">
+            <wp:extent cx="5120640" cy="3298039"/>
+            <wp:docPr id="105" name="Picture 105"/>
+            <wp:cNvGraphicFramePr>
+              <a:graphicFrameLocks noChangeAspect="1"/>
+            </wp:cNvGraphicFramePr>
+            <a:graphic>
+              <a:graphicData uri="http://schemas.openxmlformats.org/drawingml/2006/picture">
+                <pic:pic>
+                  <pic:nvPicPr>
+                    <pic:cNvPr id="0" name="06_consultas_edicao.png"/>
+                    <pic:cNvPicPr/>
+                  </pic:nvPicPr>
+                  <pic:blipFill>
+                    <a:blip r:embed="rId10"/>
+                    <a:stretch>
+                      <a:fillRect/>
+                    </a:stretch>
+                  </pic:blipFill>
+                  <pic:spPr>
+                    <a:xfrm>
+                      <a:off x="0" y="0"/>
+                      <a:ext cx="5120640" cy="3298039"/>
+                    </a:xfrm>
+                    <a:prstGeom prst="rect"/>
+                  </pic:spPr>
+                </pic:pic>
+              </a:graphicData>
+            </a:graphic>
+          </wp:inline>
+        </w:drawing>
+      </w:r>
+    </w:p>
+    <w:p>
+      <w:pPr>
+        <w:jc w:val="center"/>
+      </w:pPr>
+      <w:r>
+        <w:rPr>
+          <w:i/>
+        </w:rPr>
+        <w:t>Figura 5 - Tela de consultas, com uma consulta selecionada para edição (dados fictícios).</w:t>
+      </w:r>
+    </w:p>
+    <w:p>
+      <w:pPr>
+        <w:pStyle w:val="Ttulo2"/>
+      </w:pPr>
+      <w:r>
+        <w:t>7. Aplicação da metodologia RAD</w:t>
+      </w:r>
+    </w:p>
+    <w:p>
+      <w:r>
+        <w:t>Etapa 1 - Planejamento e requisitos (entrega em 13/10): definição do tema, do problema, do público-alvo, dos requisitos, das regras de negócio, da divisão de tarefas e do modelo preliminar do banco de dados. O feedback do professor será registrado na seção 8 e incorporado na próxima versão.</w:t>
+      </w:r>
+    </w:p>
+    <w:p>
+      <w:r>
+        <w:rPr/>
+        <w:t>Etapa 2 - Prototipação: a primeira versão em código usou Tkinter e já trazia a tela de Pacientes funcionando, enquanto as telas de Profissionais e Consultas foram feitas como protótipo (campos, botões e tabelas desabilitados, ainda sem ligação com o banco), para validar a organização das telas e o fluxo de navegação: um menu com Pacientes, Profissionais e Consultas, cada tela com formulário, busca e tabela.</w:t>
+      </w:r>
+    </w:p>
+    <w:p>
+      <w:r>
         <w:rPr>
           <w:highlight w:val="yellow"/>
         </w:rPr>
-        <w:t>Espaço reservado para as próximas etapas.</w:t>
-      </w:r>
-    </w:p>
-    <w:p>
-      <w:pPr>
-        <w:pStyle w:val="Ttulo2"/>
-      </w:pPr>
-      <w:r>
-        <w:t>7. Aplicação da metodologia RAD</w:t>
-      </w:r>
-    </w:p>
-    <w:p>
-      <w:r>
-        <w:t>Etapa 1 - Planejamento e requisitos (entrega em 13/10): definição do tema, do problema, do público-alvo, dos requisitos, das regras de negócio, da divisão de tarefas e do modelo preliminar do banco de dados. O feedback do professor será registrado na seção 8 e incorporado na próxima versão.</w:t>
+        <w:t>[PREENCHER: data da entrega da Etapa 2, formato do protótipo apresentado ao professor e feedback recebido nesta etapa.]</w:t>
+      </w:r>
+    </w:p>
+    <w:p>
+      <w:r>
+        <w:rPr/>
+        <w:t>Etapa 3 - MVP funcional: versão utilizável com interface executável (python main.py), banco SQLite criado automaticamente (clinica.db), cadastro e listagem de pacientes, profissionais e consultas gravados no banco e o relacionamento entre paciente, profissional e consulta funcionando. A persistência pode ser demonstrada cadastrando um registro, fechando o programa, abrindo-o de novo e conferindo que o registro continua na listagem; o teste automatizado test_persistencia_de_todas_as_entidades confere o mesmo. Depois dessa primeira versão, a interface foi migrada de Tkinter para CustomTkinter, foi acrescentada uma tela de login (item que não constava no escopo da Etapa 1) e as telas de Profissionais e Consultas passaram a funcionar.</w:t>
       </w:r>
     </w:p>
     <w:p>
@@ -698,7 +856,7 @@
         <w:rPr>
           <w:highlight w:val="yellow"/>
         </w:rPr>
-        <w:t>Espaço reservado: Documentar aqui as etapas realizadas, protótipo inicial, versões desenvolvidas e a participação do professor nos feedbacks ao longo do ciclo de desenvolvimento.</w:t>
+        <w:t>[PREENCHER: data da entrega da Etapa 3, feedback do professor e confirmação de que a inclusão do login foi aprovada.]</w:t>
       </w:r>
     </w:p>
     <w:p>
@@ -727,44 +885,1609 @@
     </w:p>
     <w:p>
       <w:r>
+        <w:rPr/>
+        <w:t>Os cenários abaixo foram executados por testes automáticos (python -m unittest discover -s tests -v) e por um roteiro automatizado na própria interface (login, cadastro, agendamento, conflito de horário, cancelamento, exclusão bloqueada e fechar e reabrir o programa).</w:t>
+      </w:r>
+    </w:p>
+    <w:tbl>
+      <w:tblPr>
+        <w:tblW w:type="auto" w:w="0"/>
+        <w:tblBorders>
+          <w:top w:val="single" w:sz="4" w:space="0" w:color="808080"/>
+          <w:left w:val="single" w:sz="4" w:space="0" w:color="808080"/>
+          <w:bottom w:val="single" w:sz="4" w:space="0" w:color="808080"/>
+          <w:right w:val="single" w:sz="4" w:space="0" w:color="808080"/>
+          <w:insideH w:val="single" w:sz="4" w:space="0" w:color="808080"/>
+          <w:insideV w:val="single" w:sz="4" w:space="0" w:color="808080"/>
+        </w:tblBorders>
+        <w:tblLayout w:type="fixed"/>
+        <w:tblLook w:firstColumn="1" w:firstRow="1" w:lastColumn="0" w:lastRow="0" w:noHBand="0" w:noVBand="1" w:val="04A0"/>
+      </w:tblPr>
+      <w:tblGrid>
+        <w:gridCol w:w="2160"/>
+        <w:gridCol w:w="2160"/>
+        <w:gridCol w:w="2160"/>
+        <w:gridCol w:w="2160"/>
+      </w:tblGrid>
+      <w:tr>
+        <w:trPr>
+          <w:tblHeader w:val="true"/>
+        </w:trPr>
+        <w:tc>
+          <w:tcPr>
+            <w:tcW w:type="dxa" w:w="2088"/>
+            <w:shd w:val="clear" w:color="auto" w:fill="D9E2F3"/>
+          </w:tcPr>
+          <w:p>
+            <w:pPr>
+              <w:spacing w:after="0"/>
+            </w:pPr>
+            <w:r>
+              <w:rPr>
+                <w:b/>
+                <w:sz w:val="17"/>
+              </w:rPr>
+              <w:t>Cenário</w:t>
+            </w:r>
+          </w:p>
+        </w:tc>
+        <w:tc>
+          <w:tcPr>
+            <w:tcW w:type="dxa" w:w="2304"/>
+            <w:shd w:val="clear" w:color="auto" w:fill="D9E2F3"/>
+          </w:tcPr>
+          <w:p>
+            <w:pPr>
+              <w:spacing w:after="0"/>
+            </w:pPr>
+            <w:r>
+              <w:rPr>
+                <w:b/>
+                <w:sz w:val="17"/>
+              </w:rPr>
+              <w:t>Entrada</w:t>
+            </w:r>
+          </w:p>
+        </w:tc>
+        <w:tc>
+          <w:tcPr>
+            <w:tcW w:type="dxa" w:w="2880"/>
+            <w:shd w:val="clear" w:color="auto" w:fill="D9E2F3"/>
+          </w:tcPr>
+          <w:p>
+            <w:pPr>
+              <w:spacing w:after="0"/>
+            </w:pPr>
+            <w:r>
+              <w:rPr>
+                <w:b/>
+                <w:sz w:val="17"/>
+              </w:rPr>
+              <w:t>Resultado esperado</w:t>
+            </w:r>
+          </w:p>
+        </w:tc>
+        <w:tc>
+          <w:tcPr>
+            <w:tcW w:type="dxa" w:w="1368"/>
+            <w:shd w:val="clear" w:color="auto" w:fill="D9E2F3"/>
+          </w:tcPr>
+          <w:p>
+            <w:pPr>
+              <w:spacing w:after="0"/>
+            </w:pPr>
+            <w:r>
+              <w:rPr>
+                <w:b/>
+                <w:sz w:val="17"/>
+              </w:rPr>
+              <w:t>Resultado obtido</w:t>
+            </w:r>
+          </w:p>
+        </w:tc>
+      </w:tr>
+      <w:tr>
+        <w:tc>
+          <w:tcPr>
+            <w:tcW w:type="dxa" w:w="2088"/>
+          </w:tcPr>
+          <w:p>
+            <w:pPr>
+              <w:spacing w:after="0"/>
+            </w:pPr>
+            <w:r>
+              <w:rPr>
+                <w:sz w:val="17"/>
+              </w:rPr>
+              <w:t>Cadastrar paciente</w:t>
+            </w:r>
+          </w:p>
+        </w:tc>
+        <w:tc>
+          <w:tcPr>
+            <w:tcW w:type="dxa" w:w="2304"/>
+          </w:tcPr>
+          <w:p>
+            <w:pPr>
+              <w:spacing w:after="0"/>
+            </w:pPr>
+            <w:r>
+              <w:rPr>
+                <w:sz w:val="17"/>
+              </w:rPr>
+              <w:t>Nome, CPF de 11 números e nascimento válidos</w:t>
+            </w:r>
+          </w:p>
+        </w:tc>
+        <w:tc>
+          <w:tcPr>
+            <w:tcW w:type="dxa" w:w="2880"/>
+          </w:tcPr>
+          <w:p>
+            <w:pPr>
+              <w:spacing w:after="0"/>
+            </w:pPr>
+            <w:r>
+              <w:rPr>
+                <w:sz w:val="17"/>
+              </w:rPr>
+              <w:t>Paciente gravado, mensagem de sucesso e linha na tabela</w:t>
+            </w:r>
+          </w:p>
+        </w:tc>
+        <w:tc>
+          <w:tcPr>
+            <w:tcW w:type="dxa" w:w="1368"/>
+          </w:tcPr>
+          <w:p>
+            <w:pPr>
+              <w:spacing w:after="0"/>
+            </w:pPr>
+            <w:r>
+              <w:rPr>
+                <w:sz w:val="17"/>
+              </w:rPr>
+              <w:t>Conforme esperado</w:t>
+            </w:r>
+          </w:p>
+        </w:tc>
+      </w:tr>
+      <w:tr>
+        <w:tc>
+          <w:tcPr>
+            <w:tcW w:type="dxa" w:w="2088"/>
+          </w:tcPr>
+          <w:p>
+            <w:pPr>
+              <w:spacing w:after="0"/>
+            </w:pPr>
+            <w:r>
+              <w:rPr>
+                <w:sz w:val="17"/>
+              </w:rPr>
+              <w:t>Campo obrigatório (RN02)</w:t>
+            </w:r>
+          </w:p>
+        </w:tc>
+        <w:tc>
+          <w:tcPr>
+            <w:tcW w:type="dxa" w:w="2304"/>
+          </w:tcPr>
+          <w:p>
+            <w:pPr>
+              <w:spacing w:after="0"/>
+            </w:pPr>
+            <w:r>
+              <w:rPr>
+                <w:sz w:val="17"/>
+              </w:rPr>
+              <w:t>Nome em branco</w:t>
+            </w:r>
+          </w:p>
+        </w:tc>
+        <w:tc>
+          <w:tcPr>
+            <w:tcW w:type="dxa" w:w="2880"/>
+          </w:tcPr>
+          <w:p>
+            <w:pPr>
+              <w:spacing w:after="0"/>
+            </w:pPr>
+            <w:r>
+              <w:rPr>
+                <w:sz w:val="17"/>
+              </w:rPr>
+              <w:t>Aviso "O nome é obrigatório."; nada é gravado</w:t>
+            </w:r>
+          </w:p>
+        </w:tc>
+        <w:tc>
+          <w:tcPr>
+            <w:tcW w:type="dxa" w:w="1368"/>
+          </w:tcPr>
+          <w:p>
+            <w:pPr>
+              <w:spacing w:after="0"/>
+            </w:pPr>
+            <w:r>
+              <w:rPr>
+                <w:sz w:val="17"/>
+              </w:rPr>
+              <w:t>Conforme esperado</w:t>
+            </w:r>
+          </w:p>
+        </w:tc>
+      </w:tr>
+      <w:tr>
+        <w:tc>
+          <w:tcPr>
+            <w:tcW w:type="dxa" w:w="2088"/>
+          </w:tcPr>
+          <w:p>
+            <w:pPr>
+              <w:spacing w:after="0"/>
+            </w:pPr>
+            <w:r>
+              <w:rPr>
+                <w:sz w:val="17"/>
+              </w:rPr>
+              <w:t>CPF incompleto</w:t>
+            </w:r>
+          </w:p>
+        </w:tc>
+        <w:tc>
+          <w:tcPr>
+            <w:tcW w:type="dxa" w:w="2304"/>
+          </w:tcPr>
+          <w:p>
+            <w:pPr>
+              <w:spacing w:after="0"/>
+            </w:pPr>
+            <w:r>
+              <w:rPr>
+                <w:sz w:val="17"/>
+              </w:rPr>
+              <w:t>CPF com menos de 11 números</w:t>
+            </w:r>
+          </w:p>
+        </w:tc>
+        <w:tc>
+          <w:tcPr>
+            <w:tcW w:type="dxa" w:w="2880"/>
+          </w:tcPr>
+          <w:p>
+            <w:pPr>
+              <w:spacing w:after="0"/>
+            </w:pPr>
+            <w:r>
+              <w:rPr>
+                <w:sz w:val="17"/>
+              </w:rPr>
+              <w:t>Aviso de CPF inválido; nada é gravado</w:t>
+            </w:r>
+          </w:p>
+        </w:tc>
+        <w:tc>
+          <w:tcPr>
+            <w:tcW w:type="dxa" w:w="1368"/>
+          </w:tcPr>
+          <w:p>
+            <w:pPr>
+              <w:spacing w:after="0"/>
+            </w:pPr>
+            <w:r>
+              <w:rPr>
+                <w:sz w:val="17"/>
+              </w:rPr>
+              <w:t>Conforme esperado</w:t>
+            </w:r>
+          </w:p>
+        </w:tc>
+      </w:tr>
+      <w:tr>
+        <w:tc>
+          <w:tcPr>
+            <w:tcW w:type="dxa" w:w="2088"/>
+          </w:tcPr>
+          <w:p>
+            <w:pPr>
+              <w:spacing w:after="0"/>
+            </w:pPr>
+            <w:r>
+              <w:rPr>
+                <w:sz w:val="17"/>
+              </w:rPr>
+              <w:t>CPF repetido (RN06)</w:t>
+            </w:r>
+          </w:p>
+        </w:tc>
+        <w:tc>
+          <w:tcPr>
+            <w:tcW w:type="dxa" w:w="2304"/>
+          </w:tcPr>
+          <w:p>
+            <w:pPr>
+              <w:spacing w:after="0"/>
+            </w:pPr>
+            <w:r>
+              <w:rPr>
+                <w:sz w:val="17"/>
+              </w:rPr>
+              <w:t>CPF já cadastrado</w:t>
+            </w:r>
+          </w:p>
+        </w:tc>
+        <w:tc>
+          <w:tcPr>
+            <w:tcW w:type="dxa" w:w="2880"/>
+          </w:tcPr>
+          <w:p>
+            <w:pPr>
+              <w:spacing w:after="0"/>
+            </w:pPr>
+            <w:r>
+              <w:rPr>
+                <w:sz w:val="17"/>
+              </w:rPr>
+              <w:t>Aviso "Já existe um paciente cadastrado com este CPF."</w:t>
+            </w:r>
+          </w:p>
+        </w:tc>
+        <w:tc>
+          <w:tcPr>
+            <w:tcW w:type="dxa" w:w="1368"/>
+          </w:tcPr>
+          <w:p>
+            <w:pPr>
+              <w:spacing w:after="0"/>
+            </w:pPr>
+            <w:r>
+              <w:rPr>
+                <w:sz w:val="17"/>
+              </w:rPr>
+              <w:t>Conforme esperado</w:t>
+            </w:r>
+          </w:p>
+        </w:tc>
+      </w:tr>
+      <w:tr>
+        <w:tc>
+          <w:tcPr>
+            <w:tcW w:type="dxa" w:w="2088"/>
+          </w:tcPr>
+          <w:p>
+            <w:pPr>
+              <w:spacing w:after="0"/>
+            </w:pPr>
+            <w:r>
+              <w:rPr>
+                <w:sz w:val="17"/>
+              </w:rPr>
+              <w:t>Nascimento futuro (RN05)</w:t>
+            </w:r>
+          </w:p>
+        </w:tc>
+        <w:tc>
+          <w:tcPr>
+            <w:tcW w:type="dxa" w:w="2304"/>
+          </w:tcPr>
+          <w:p>
+            <w:pPr>
+              <w:spacing w:after="0"/>
+            </w:pPr>
+            <w:r>
+              <w:rPr>
+                <w:sz w:val="17"/>
+              </w:rPr>
+              <w:t>Data de nascimento depois de hoje</w:t>
+            </w:r>
+          </w:p>
+        </w:tc>
+        <w:tc>
+          <w:tcPr>
+            <w:tcW w:type="dxa" w:w="2880"/>
+          </w:tcPr>
+          <w:p>
+            <w:pPr>
+              <w:spacing w:after="0"/>
+            </w:pPr>
+            <w:r>
+              <w:rPr>
+                <w:sz w:val="17"/>
+              </w:rPr>
+              <w:t>Aviso de data inválida; nada é gravado</w:t>
+            </w:r>
+          </w:p>
+        </w:tc>
+        <w:tc>
+          <w:tcPr>
+            <w:tcW w:type="dxa" w:w="1368"/>
+          </w:tcPr>
+          <w:p>
+            <w:pPr>
+              <w:spacing w:after="0"/>
+            </w:pPr>
+            <w:r>
+              <w:rPr>
+                <w:sz w:val="17"/>
+              </w:rPr>
+              <w:t>Conforme esperado</w:t>
+            </w:r>
+          </w:p>
+        </w:tc>
+      </w:tr>
+      <w:tr>
+        <w:tc>
+          <w:tcPr>
+            <w:tcW w:type="dxa" w:w="2088"/>
+          </w:tcPr>
+          <w:p>
+            <w:pPr>
+              <w:spacing w:after="0"/>
+            </w:pPr>
+            <w:r>
+              <w:rPr>
+                <w:sz w:val="17"/>
+              </w:rPr>
+              <w:t>Excluir paciente com consulta (RN04)</w:t>
+            </w:r>
+          </w:p>
+        </w:tc>
+        <w:tc>
+          <w:tcPr>
+            <w:tcW w:type="dxa" w:w="2304"/>
+          </w:tcPr>
+          <w:p>
+            <w:pPr>
+              <w:spacing w:after="0"/>
+            </w:pPr>
+            <w:r>
+              <w:rPr>
+                <w:sz w:val="17"/>
+              </w:rPr>
+              <w:t>Paciente que possui consulta</w:t>
+            </w:r>
+          </w:p>
+        </w:tc>
+        <w:tc>
+          <w:tcPr>
+            <w:tcW w:type="dxa" w:w="2880"/>
+          </w:tcPr>
+          <w:p>
+            <w:pPr>
+              <w:spacing w:after="0"/>
+            </w:pPr>
+            <w:r>
+              <w:rPr>
+                <w:sz w:val="17"/>
+              </w:rPr>
+              <w:t>Exclusão bloqueada, informando a quantidade de consultas vinculadas</w:t>
+            </w:r>
+          </w:p>
+        </w:tc>
+        <w:tc>
+          <w:tcPr>
+            <w:tcW w:type="dxa" w:w="1368"/>
+          </w:tcPr>
+          <w:p>
+            <w:pPr>
+              <w:spacing w:after="0"/>
+            </w:pPr>
+            <w:r>
+              <w:rPr>
+                <w:sz w:val="17"/>
+              </w:rPr>
+              <w:t>Conforme esperado</w:t>
+            </w:r>
+          </w:p>
+        </w:tc>
+      </w:tr>
+      <w:tr>
+        <w:tc>
+          <w:tcPr>
+            <w:tcW w:type="dxa" w:w="2088"/>
+          </w:tcPr>
+          <w:p>
+            <w:pPr>
+              <w:spacing w:after="0"/>
+            </w:pPr>
+            <w:r>
+              <w:rPr>
+                <w:sz w:val="17"/>
+              </w:rPr>
+              <w:t>Cadastrar profissional</w:t>
+            </w:r>
+          </w:p>
+        </w:tc>
+        <w:tc>
+          <w:tcPr>
+            <w:tcW w:type="dxa" w:w="2304"/>
+          </w:tcPr>
+          <w:p>
+            <w:pPr>
+              <w:spacing w:after="0"/>
+            </w:pPr>
+            <w:r>
+              <w:rPr>
+                <w:sz w:val="17"/>
+              </w:rPr>
+              <w:t>Nome, registro e especialidade</w:t>
+            </w:r>
+          </w:p>
+        </w:tc>
+        <w:tc>
+          <w:tcPr>
+            <w:tcW w:type="dxa" w:w="2880"/>
+          </w:tcPr>
+          <w:p>
+            <w:pPr>
+              <w:spacing w:after="0"/>
+            </w:pPr>
+            <w:r>
+              <w:rPr>
+                <w:sz w:val="17"/>
+              </w:rPr>
+              <w:t>Profissional gravado e listado</w:t>
+            </w:r>
+          </w:p>
+        </w:tc>
+        <w:tc>
+          <w:tcPr>
+            <w:tcW w:type="dxa" w:w="1368"/>
+          </w:tcPr>
+          <w:p>
+            <w:pPr>
+              <w:spacing w:after="0"/>
+            </w:pPr>
+            <w:r>
+              <w:rPr>
+                <w:sz w:val="17"/>
+              </w:rPr>
+              <w:t>Conforme esperado</w:t>
+            </w:r>
+          </w:p>
+        </w:tc>
+      </w:tr>
+      <w:tr>
+        <w:tc>
+          <w:tcPr>
+            <w:tcW w:type="dxa" w:w="2088"/>
+          </w:tcPr>
+          <w:p>
+            <w:pPr>
+              <w:spacing w:after="0"/>
+            </w:pPr>
+            <w:r>
+              <w:rPr>
+                <w:sz w:val="17"/>
+              </w:rPr>
+              <w:t>Registro repetido (RN06)</w:t>
+            </w:r>
+          </w:p>
+        </w:tc>
+        <w:tc>
+          <w:tcPr>
+            <w:tcW w:type="dxa" w:w="2304"/>
+          </w:tcPr>
+          <w:p>
+            <w:pPr>
+              <w:spacing w:after="0"/>
+            </w:pPr>
+            <w:r>
+              <w:rPr>
+                <w:sz w:val="17"/>
+              </w:rPr>
+              <w:t>Registro profissional já existente</w:t>
+            </w:r>
+          </w:p>
+        </w:tc>
+        <w:tc>
+          <w:tcPr>
+            <w:tcW w:type="dxa" w:w="2880"/>
+          </w:tcPr>
+          <w:p>
+            <w:pPr>
+              <w:spacing w:after="0"/>
+            </w:pPr>
+            <w:r>
+              <w:rPr>
+                <w:sz w:val="17"/>
+              </w:rPr>
+              <w:t>Aviso "Já existe um profissional cadastrado com este registro profissional."</w:t>
+            </w:r>
+          </w:p>
+        </w:tc>
+        <w:tc>
+          <w:tcPr>
+            <w:tcW w:type="dxa" w:w="1368"/>
+          </w:tcPr>
+          <w:p>
+            <w:pPr>
+              <w:spacing w:after="0"/>
+            </w:pPr>
+            <w:r>
+              <w:rPr>
+                <w:sz w:val="17"/>
+              </w:rPr>
+              <w:t>Conforme esperado</w:t>
+            </w:r>
+          </w:p>
+        </w:tc>
+      </w:tr>
+      <w:tr>
+        <w:tc>
+          <w:tcPr>
+            <w:tcW w:type="dxa" w:w="2088"/>
+          </w:tcPr>
+          <w:p>
+            <w:pPr>
+              <w:spacing w:after="0"/>
+            </w:pPr>
+            <w:r>
+              <w:rPr>
+                <w:sz w:val="17"/>
+              </w:rPr>
+              <w:t>Excluir profissional com consulta (RN04)</w:t>
+            </w:r>
+          </w:p>
+        </w:tc>
+        <w:tc>
+          <w:tcPr>
+            <w:tcW w:type="dxa" w:w="2304"/>
+          </w:tcPr>
+          <w:p>
+            <w:pPr>
+              <w:spacing w:after="0"/>
+            </w:pPr>
+            <w:r>
+              <w:rPr>
+                <w:sz w:val="17"/>
+              </w:rPr>
+              <w:t>Profissional que possui consulta</w:t>
+            </w:r>
+          </w:p>
+        </w:tc>
+        <w:tc>
+          <w:tcPr>
+            <w:tcW w:type="dxa" w:w="2880"/>
+          </w:tcPr>
+          <w:p>
+            <w:pPr>
+              <w:spacing w:after="0"/>
+            </w:pPr>
+            <w:r>
+              <w:rPr>
+                <w:sz w:val="17"/>
+              </w:rPr>
+              <w:t>Exclusão bloqueada, sugerindo "Inativar"</w:t>
+            </w:r>
+          </w:p>
+        </w:tc>
+        <w:tc>
+          <w:tcPr>
+            <w:tcW w:type="dxa" w:w="1368"/>
+          </w:tcPr>
+          <w:p>
+            <w:pPr>
+              <w:spacing w:after="0"/>
+            </w:pPr>
+            <w:r>
+              <w:rPr>
+                <w:sz w:val="17"/>
+              </w:rPr>
+              <w:t>Conforme esperado</w:t>
+            </w:r>
+          </w:p>
+        </w:tc>
+      </w:tr>
+      <w:tr>
+        <w:tc>
+          <w:tcPr>
+            <w:tcW w:type="dxa" w:w="2088"/>
+          </w:tcPr>
+          <w:p>
+            <w:pPr>
+              <w:spacing w:after="0"/>
+            </w:pPr>
+            <w:r>
+              <w:rPr>
+                <w:sz w:val="17"/>
+              </w:rPr>
+              <w:t>Agendar consulta</w:t>
+            </w:r>
+          </w:p>
+        </w:tc>
+        <w:tc>
+          <w:tcPr>
+            <w:tcW w:type="dxa" w:w="2304"/>
+          </w:tcPr>
+          <w:p>
+            <w:pPr>
+              <w:spacing w:after="0"/>
+            </w:pPr>
+            <w:r>
+              <w:rPr>
+                <w:sz w:val="17"/>
+              </w:rPr>
+              <w:t>Paciente, profissional, data futura e horário livre</w:t>
+            </w:r>
+          </w:p>
+        </w:tc>
+        <w:tc>
+          <w:tcPr>
+            <w:tcW w:type="dxa" w:w="2880"/>
+          </w:tcPr>
+          <w:p>
+            <w:pPr>
+              <w:spacing w:after="0"/>
+            </w:pPr>
+            <w:r>
+              <w:rPr>
+                <w:sz w:val="17"/>
+              </w:rPr>
+              <w:t>Consulta gravada como 'Agendada', com término 30 minutos depois</w:t>
+            </w:r>
+          </w:p>
+        </w:tc>
+        <w:tc>
+          <w:tcPr>
+            <w:tcW w:type="dxa" w:w="1368"/>
+          </w:tcPr>
+          <w:p>
+            <w:pPr>
+              <w:spacing w:after="0"/>
+            </w:pPr>
+            <w:r>
+              <w:rPr>
+                <w:sz w:val="17"/>
+              </w:rPr>
+              <w:t>Conforme esperado</w:t>
+            </w:r>
+          </w:p>
+        </w:tc>
+      </w:tr>
+      <w:tr>
+        <w:tc>
+          <w:tcPr>
+            <w:tcW w:type="dxa" w:w="2088"/>
+          </w:tcPr>
+          <w:p>
+            <w:pPr>
+              <w:spacing w:after="0"/>
+            </w:pPr>
+            <w:r>
+              <w:rPr>
+                <w:sz w:val="17"/>
+              </w:rPr>
+              <w:t>Conflito de horário (RN01)</w:t>
+            </w:r>
+          </w:p>
+        </w:tc>
+        <w:tc>
+          <w:tcPr>
+            <w:tcW w:type="dxa" w:w="2304"/>
+          </w:tcPr>
+          <w:p>
+            <w:pPr>
+              <w:spacing w:after="0"/>
+            </w:pPr>
+            <w:r>
+              <w:rPr>
+                <w:sz w:val="17"/>
+              </w:rPr>
+              <w:t>Mesmo profissional, mesmo dia e mesmo horário de início</w:t>
+            </w:r>
+          </w:p>
+        </w:tc>
+        <w:tc>
+          <w:tcPr>
+            <w:tcW w:type="dxa" w:w="2880"/>
+          </w:tcPr>
+          <w:p>
+            <w:pPr>
+              <w:spacing w:after="0"/>
+            </w:pPr>
+            <w:r>
+              <w:rPr>
+                <w:sz w:val="17"/>
+              </w:rPr>
+              <w:t>Agendamento recusado (conferência no sistema e índice único no banco)</w:t>
+            </w:r>
+          </w:p>
+        </w:tc>
+        <w:tc>
+          <w:tcPr>
+            <w:tcW w:type="dxa" w:w="1368"/>
+          </w:tcPr>
+          <w:p>
+            <w:pPr>
+              <w:spacing w:after="0"/>
+            </w:pPr>
+            <w:r>
+              <w:rPr>
+                <w:sz w:val="17"/>
+              </w:rPr>
+              <w:t>Conforme esperado</w:t>
+            </w:r>
+          </w:p>
+        </w:tc>
+      </w:tr>
+      <w:tr>
+        <w:tc>
+          <w:tcPr>
+            <w:tcW w:type="dxa" w:w="2088"/>
+          </w:tcPr>
+          <w:p>
+            <w:pPr>
+              <w:spacing w:after="0"/>
+            </w:pPr>
+            <w:r>
+              <w:rPr>
+                <w:sz w:val="17"/>
+              </w:rPr>
+              <w:t>Data e hora passadas (RN05)</w:t>
+            </w:r>
+          </w:p>
+        </w:tc>
+        <w:tc>
+          <w:tcPr>
+            <w:tcW w:type="dxa" w:w="2304"/>
+          </w:tcPr>
+          <w:p>
+            <w:pPr>
+              <w:spacing w:after="0"/>
+            </w:pPr>
+            <w:r>
+              <w:rPr>
+                <w:sz w:val="17"/>
+              </w:rPr>
+              <w:t>Data anterior a hoje</w:t>
+            </w:r>
+          </w:p>
+        </w:tc>
+        <w:tc>
+          <w:tcPr>
+            <w:tcW w:type="dxa" w:w="2880"/>
+          </w:tcPr>
+          <w:p>
+            <w:pPr>
+              <w:spacing w:after="0"/>
+            </w:pPr>
+            <w:r>
+              <w:rPr>
+                <w:sz w:val="17"/>
+              </w:rPr>
+              <w:t>Agendamento recusado</w:t>
+            </w:r>
+          </w:p>
+        </w:tc>
+        <w:tc>
+          <w:tcPr>
+            <w:tcW w:type="dxa" w:w="1368"/>
+          </w:tcPr>
+          <w:p>
+            <w:pPr>
+              <w:spacing w:after="0"/>
+            </w:pPr>
+            <w:r>
+              <w:rPr>
+                <w:sz w:val="17"/>
+              </w:rPr>
+              <w:t>Conforme esperado</w:t>
+            </w:r>
+          </w:p>
+        </w:tc>
+      </w:tr>
+      <w:tr>
+        <w:tc>
+          <w:tcPr>
+            <w:tcW w:type="dxa" w:w="2088"/>
+          </w:tcPr>
+          <w:p>
+            <w:pPr>
+              <w:spacing w:after="0"/>
+            </w:pPr>
+            <w:r>
+              <w:rPr>
+                <w:sz w:val="17"/>
+              </w:rPr>
+              <w:t>Horário inválido</w:t>
+            </w:r>
+          </w:p>
+        </w:tc>
+        <w:tc>
+          <w:tcPr>
+            <w:tcW w:type="dxa" w:w="2304"/>
+          </w:tcPr>
+          <w:p>
+            <w:pPr>
+              <w:spacing w:after="0"/>
+            </w:pPr>
+            <w:r>
+              <w:rPr>
+                <w:sz w:val="17"/>
+              </w:rPr>
+              <w:t>Horário 25:75</w:t>
+            </w:r>
+          </w:p>
+        </w:tc>
+        <w:tc>
+          <w:tcPr>
+            <w:tcW w:type="dxa" w:w="2880"/>
+          </w:tcPr>
+          <w:p>
+            <w:pPr>
+              <w:spacing w:after="0"/>
+            </w:pPr>
+            <w:r>
+              <w:rPr>
+                <w:sz w:val="17"/>
+              </w:rPr>
+              <w:t>Aviso "Horário inválido. Digite no formato HH:MM (ex.: 09:30)."</w:t>
+            </w:r>
+          </w:p>
+        </w:tc>
+        <w:tc>
+          <w:tcPr>
+            <w:tcW w:type="dxa" w:w="1368"/>
+          </w:tcPr>
+          <w:p>
+            <w:pPr>
+              <w:spacing w:after="0"/>
+            </w:pPr>
+            <w:r>
+              <w:rPr>
+                <w:sz w:val="17"/>
+              </w:rPr>
+              <w:t>Conforme esperado</w:t>
+            </w:r>
+          </w:p>
+        </w:tc>
+      </w:tr>
+      <w:tr>
+        <w:tc>
+          <w:tcPr>
+            <w:tcW w:type="dxa" w:w="2088"/>
+          </w:tcPr>
+          <w:p>
+            <w:pPr>
+              <w:spacing w:after="0"/>
+            </w:pPr>
+            <w:r>
+              <w:rPr>
+                <w:sz w:val="17"/>
+              </w:rPr>
+              <w:t>Profissional inativo</w:t>
+            </w:r>
+          </w:p>
+        </w:tc>
+        <w:tc>
+          <w:tcPr>
+            <w:tcW w:type="dxa" w:w="2304"/>
+          </w:tcPr>
+          <w:p>
+            <w:pPr>
+              <w:spacing w:after="0"/>
+            </w:pPr>
+            <w:r>
+              <w:rPr>
+                <w:sz w:val="17"/>
+              </w:rPr>
+              <w:t>Agendar com um profissional inativo</w:t>
+            </w:r>
+          </w:p>
+        </w:tc>
+        <w:tc>
+          <w:tcPr>
+            <w:tcW w:type="dxa" w:w="2880"/>
+          </w:tcPr>
+          <w:p>
+            <w:pPr>
+              <w:spacing w:after="0"/>
+            </w:pPr>
+            <w:r>
+              <w:rPr>
+                <w:sz w:val="17"/>
+              </w:rPr>
+              <w:t>Agendamento recusado</w:t>
+            </w:r>
+          </w:p>
+        </w:tc>
+        <w:tc>
+          <w:tcPr>
+            <w:tcW w:type="dxa" w:w="1368"/>
+          </w:tcPr>
+          <w:p>
+            <w:pPr>
+              <w:spacing w:after="0"/>
+            </w:pPr>
+            <w:r>
+              <w:rPr>
+                <w:sz w:val="17"/>
+              </w:rPr>
+              <w:t>Conforme esperado</w:t>
+            </w:r>
+          </w:p>
+        </w:tc>
+      </w:tr>
+      <w:tr>
+        <w:tc>
+          <w:tcPr>
+            <w:tcW w:type="dxa" w:w="2088"/>
+          </w:tcPr>
+          <w:p>
+            <w:pPr>
+              <w:spacing w:after="0"/>
+            </w:pPr>
+            <w:r>
+              <w:rPr>
+                <w:sz w:val="17"/>
+              </w:rPr>
+              <w:t>Cancelar consulta (RN07)</w:t>
+            </w:r>
+          </w:p>
+        </w:tc>
+        <w:tc>
+          <w:tcPr>
+            <w:tcW w:type="dxa" w:w="2304"/>
+          </w:tcPr>
+          <w:p>
+            <w:pPr>
+              <w:spacing w:after="0"/>
+            </w:pPr>
+            <w:r>
+              <w:rPr>
+                <w:sz w:val="17"/>
+              </w:rPr>
+              <w:t>Cancelar uma consulta agendada, com motivo</w:t>
+            </w:r>
+          </w:p>
+        </w:tc>
+        <w:tc>
+          <w:tcPr>
+            <w:tcW w:type="dxa" w:w="2880"/>
+          </w:tcPr>
+          <w:p>
+            <w:pPr>
+              <w:spacing w:after="0"/>
+            </w:pPr>
+            <w:r>
+              <w:rPr>
+                <w:sz w:val="17"/>
+              </w:rPr>
+              <w:t>Situação 'Cancelada'; a consulta continua no histórico</w:t>
+            </w:r>
+          </w:p>
+        </w:tc>
+        <w:tc>
+          <w:tcPr>
+            <w:tcW w:type="dxa" w:w="1368"/>
+          </w:tcPr>
+          <w:p>
+            <w:pPr>
+              <w:spacing w:after="0"/>
+            </w:pPr>
+            <w:r>
+              <w:rPr>
+                <w:sz w:val="17"/>
+              </w:rPr>
+              <w:t>Conforme esperado</w:t>
+            </w:r>
+          </w:p>
+        </w:tc>
+      </w:tr>
+      <w:tr>
+        <w:tc>
+          <w:tcPr>
+            <w:tcW w:type="dxa" w:w="2088"/>
+          </w:tcPr>
+          <w:p>
+            <w:pPr>
+              <w:spacing w:after="0"/>
+            </w:pPr>
+            <w:r>
+              <w:rPr>
+                <w:sz w:val="17"/>
+              </w:rPr>
+              <w:t>Horário liberado</w:t>
+            </w:r>
+          </w:p>
+        </w:tc>
+        <w:tc>
+          <w:tcPr>
+            <w:tcW w:type="dxa" w:w="2304"/>
+          </w:tcPr>
+          <w:p>
+            <w:pPr>
+              <w:spacing w:after="0"/>
+            </w:pPr>
+            <w:r>
+              <w:rPr>
+                <w:sz w:val="17"/>
+              </w:rPr>
+              <w:t>Novo agendamento no horário de uma consulta cancelada</w:t>
+            </w:r>
+          </w:p>
+        </w:tc>
+        <w:tc>
+          <w:tcPr>
+            <w:tcW w:type="dxa" w:w="2880"/>
+          </w:tcPr>
+          <w:p>
+            <w:pPr>
+              <w:spacing w:after="0"/>
+            </w:pPr>
+            <w:r>
+              <w:rPr>
+                <w:sz w:val="17"/>
+              </w:rPr>
+              <w:t>Agendamento permitido</w:t>
+            </w:r>
+          </w:p>
+        </w:tc>
+        <w:tc>
+          <w:tcPr>
+            <w:tcW w:type="dxa" w:w="1368"/>
+          </w:tcPr>
+          <w:p>
+            <w:pPr>
+              <w:spacing w:after="0"/>
+            </w:pPr>
+            <w:r>
+              <w:rPr>
+                <w:sz w:val="17"/>
+              </w:rPr>
+              <w:t>Conforme esperado</w:t>
+            </w:r>
+          </w:p>
+        </w:tc>
+      </w:tr>
+      <w:tr>
+        <w:tc>
+          <w:tcPr>
+            <w:tcW w:type="dxa" w:w="2088"/>
+          </w:tcPr>
+          <w:p>
+            <w:pPr>
+              <w:spacing w:after="0"/>
+            </w:pPr>
+            <w:r>
+              <w:rPr>
+                <w:sz w:val="17"/>
+              </w:rPr>
+              <w:t>Remarcar consulta</w:t>
+            </w:r>
+          </w:p>
+        </w:tc>
+        <w:tc>
+          <w:tcPr>
+            <w:tcW w:type="dxa" w:w="2304"/>
+          </w:tcPr>
+          <w:p>
+            <w:pPr>
+              <w:spacing w:after="0"/>
+            </w:pPr>
+            <w:r>
+              <w:rPr>
+                <w:sz w:val="17"/>
+              </w:rPr>
+              <w:t>Alterar data ou horário de uma consulta agendada</w:t>
+            </w:r>
+          </w:p>
+        </w:tc>
+        <w:tc>
+          <w:tcPr>
+            <w:tcW w:type="dxa" w:w="2880"/>
+          </w:tcPr>
+          <w:p>
+            <w:pPr>
+              <w:spacing w:after="0"/>
+            </w:pPr>
+            <w:r>
+              <w:rPr>
+                <w:sz w:val="17"/>
+              </w:rPr>
+              <w:t>Dados atualizados</w:t>
+            </w:r>
+          </w:p>
+        </w:tc>
+        <w:tc>
+          <w:tcPr>
+            <w:tcW w:type="dxa" w:w="1368"/>
+          </w:tcPr>
+          <w:p>
+            <w:pPr>
+              <w:spacing w:after="0"/>
+            </w:pPr>
+            <w:r>
+              <w:rPr>
+                <w:sz w:val="17"/>
+              </w:rPr>
+              <w:t>Conforme esperado</w:t>
+            </w:r>
+          </w:p>
+        </w:tc>
+      </w:tr>
+      <w:tr>
+        <w:tc>
+          <w:tcPr>
+            <w:tcW w:type="dxa" w:w="2088"/>
+          </w:tcPr>
+          <w:p>
+            <w:pPr>
+              <w:spacing w:after="0"/>
+            </w:pPr>
+            <w:r>
+              <w:rPr>
+                <w:sz w:val="17"/>
+              </w:rPr>
+              <w:t>Marcar como realizada</w:t>
+            </w:r>
+          </w:p>
+        </w:tc>
+        <w:tc>
+          <w:tcPr>
+            <w:tcW w:type="dxa" w:w="2304"/>
+          </w:tcPr>
+          <w:p>
+            <w:pPr>
+              <w:spacing w:after="0"/>
+            </w:pPr>
+            <w:r>
+              <w:rPr>
+                <w:sz w:val="17"/>
+              </w:rPr>
+              <w:t>Consulta agendada</w:t>
+            </w:r>
+          </w:p>
+        </w:tc>
+        <w:tc>
+          <w:tcPr>
+            <w:tcW w:type="dxa" w:w="2880"/>
+          </w:tcPr>
+          <w:p>
+            <w:pPr>
+              <w:spacing w:after="0"/>
+            </w:pPr>
+            <w:r>
+              <w:rPr>
+                <w:sz w:val="17"/>
+              </w:rPr>
+              <w:t>Situação 'Realizada'</w:t>
+            </w:r>
+          </w:p>
+        </w:tc>
+        <w:tc>
+          <w:tcPr>
+            <w:tcW w:type="dxa" w:w="1368"/>
+          </w:tcPr>
+          <w:p>
+            <w:pPr>
+              <w:spacing w:after="0"/>
+            </w:pPr>
+            <w:r>
+              <w:rPr>
+                <w:sz w:val="17"/>
+              </w:rPr>
+              <w:t>Conforme esperado</w:t>
+            </w:r>
+          </w:p>
+        </w:tc>
+      </w:tr>
+      <w:tr>
+        <w:tc>
+          <w:tcPr>
+            <w:tcW w:type="dxa" w:w="2088"/>
+          </w:tcPr>
+          <w:p>
+            <w:pPr>
+              <w:spacing w:after="0"/>
+            </w:pPr>
+            <w:r>
+              <w:rPr>
+                <w:sz w:val="17"/>
+              </w:rPr>
+              <w:t>Busca por data (RF06)</w:t>
+            </w:r>
+          </w:p>
+        </w:tc>
+        <w:tc>
+          <w:tcPr>
+            <w:tcW w:type="dxa" w:w="2304"/>
+          </w:tcPr>
+          <w:p>
+            <w:pPr>
+              <w:spacing w:after="0"/>
+            </w:pPr>
+            <w:r>
+              <w:rPr>
+                <w:sz w:val="17"/>
+              </w:rPr>
+              <w:t>Digitar 20/12/2030 na busca</w:t>
+            </w:r>
+          </w:p>
+        </w:tc>
+        <w:tc>
+          <w:tcPr>
+            <w:tcW w:type="dxa" w:w="2880"/>
+          </w:tcPr>
+          <w:p>
+            <w:pPr>
+              <w:spacing w:after="0"/>
+            </w:pPr>
+            <w:r>
+              <w:rPr>
+                <w:sz w:val="17"/>
+              </w:rPr>
+              <w:t>Lista só as consultas desse dia</w:t>
+            </w:r>
+          </w:p>
+        </w:tc>
+        <w:tc>
+          <w:tcPr>
+            <w:tcW w:type="dxa" w:w="1368"/>
+          </w:tcPr>
+          <w:p>
+            <w:pPr>
+              <w:spacing w:after="0"/>
+            </w:pPr>
+            <w:r>
+              <w:rPr>
+                <w:sz w:val="17"/>
+              </w:rPr>
+              <w:t>Conforme esperado</w:t>
+            </w:r>
+          </w:p>
+        </w:tc>
+      </w:tr>
+      <w:tr>
+        <w:tc>
+          <w:tcPr>
+            <w:tcW w:type="dxa" w:w="2088"/>
+          </w:tcPr>
+          <w:p>
+            <w:pPr>
+              <w:spacing w:after="0"/>
+            </w:pPr>
+            <w:r>
+              <w:rPr>
+                <w:sz w:val="17"/>
+              </w:rPr>
+              <w:t>Login</w:t>
+            </w:r>
+          </w:p>
+        </w:tc>
+        <w:tc>
+          <w:tcPr>
+            <w:tcW w:type="dxa" w:w="2304"/>
+          </w:tcPr>
+          <w:p>
+            <w:pPr>
+              <w:spacing w:after="0"/>
+            </w:pPr>
+            <w:r>
+              <w:rPr>
+                <w:sz w:val="17"/>
+              </w:rPr>
+              <w:t>Usuário e senha corretos e incorretos</w:t>
+            </w:r>
+          </w:p>
+        </w:tc>
+        <w:tc>
+          <w:tcPr>
+            <w:tcW w:type="dxa" w:w="2880"/>
+          </w:tcPr>
+          <w:p>
+            <w:pPr>
+              <w:spacing w:after="0"/>
+            </w:pPr>
+            <w:r>
+              <w:rPr>
+                <w:sz w:val="17"/>
+              </w:rPr>
+              <w:t>Corretos abrem o sistema; incorretos mostram "Usuário ou senha incorretos."</w:t>
+            </w:r>
+          </w:p>
+        </w:tc>
+        <w:tc>
+          <w:tcPr>
+            <w:tcW w:type="dxa" w:w="1368"/>
+          </w:tcPr>
+          <w:p>
+            <w:pPr>
+              <w:spacing w:after="0"/>
+            </w:pPr>
+            <w:r>
+              <w:rPr>
+                <w:sz w:val="17"/>
+              </w:rPr>
+              <w:t>Conforme esperado</w:t>
+            </w:r>
+          </w:p>
+        </w:tc>
+      </w:tr>
+      <w:tr>
+        <w:tc>
+          <w:tcPr>
+            <w:tcW w:type="dxa" w:w="2088"/>
+          </w:tcPr>
+          <w:p>
+            <w:pPr>
+              <w:spacing w:after="0"/>
+            </w:pPr>
+            <w:r>
+              <w:rPr>
+                <w:sz w:val="17"/>
+              </w:rPr>
+              <w:t>Persistência</w:t>
+            </w:r>
+          </w:p>
+        </w:tc>
+        <w:tc>
+          <w:tcPr>
+            <w:tcW w:type="dxa" w:w="2304"/>
+          </w:tcPr>
+          <w:p>
+            <w:pPr>
+              <w:spacing w:after="0"/>
+            </w:pPr>
+            <w:r>
+              <w:rPr>
+                <w:sz w:val="17"/>
+              </w:rPr>
+              <w:t>Fechar e abrir o programa de novo</w:t>
+            </w:r>
+          </w:p>
+        </w:tc>
+        <w:tc>
+          <w:tcPr>
+            <w:tcW w:type="dxa" w:w="2880"/>
+          </w:tcPr>
+          <w:p>
+            <w:pPr>
+              <w:spacing w:after="0"/>
+            </w:pPr>
+            <w:r>
+              <w:rPr>
+                <w:sz w:val="17"/>
+              </w:rPr>
+              <w:t>Pacientes, profissionais e consultas continuam gravados</w:t>
+            </w:r>
+          </w:p>
+        </w:tc>
+        <w:tc>
+          <w:tcPr>
+            <w:tcW w:type="dxa" w:w="1368"/>
+          </w:tcPr>
+          <w:p>
+            <w:pPr>
+              <w:spacing w:after="0"/>
+            </w:pPr>
+            <w:r>
+              <w:rPr>
+                <w:sz w:val="17"/>
+              </w:rPr>
+              <w:t>Conforme esperado</w:t>
+            </w:r>
+          </w:p>
+        </w:tc>
+      </w:tr>
+      <w:tr>
+        <w:tc>
+          <w:tcPr>
+            <w:tcW w:type="dxa" w:w="2088"/>
+          </w:tcPr>
+          <w:p>
+            <w:pPr>
+              <w:spacing w:after="0"/>
+            </w:pPr>
+            <w:r>
+              <w:rPr>
+                <w:sz w:val="17"/>
+              </w:rPr>
+              <w:t>Erro inesperado (RN03)</w:t>
+            </w:r>
+          </w:p>
+        </w:tc>
+        <w:tc>
+          <w:tcPr>
+            <w:tcW w:type="dxa" w:w="2304"/>
+          </w:tcPr>
+          <w:p>
+            <w:pPr>
+              <w:spacing w:after="0"/>
+            </w:pPr>
+            <w:r>
+              <w:rPr>
+                <w:sz w:val="17"/>
+              </w:rPr>
+              <w:t>Falha não prevista durante uma ação</w:t>
+            </w:r>
+          </w:p>
+        </w:tc>
+        <w:tc>
+          <w:tcPr>
+            <w:tcW w:type="dxa" w:w="2880"/>
+          </w:tcPr>
+          <w:p>
+            <w:pPr>
+              <w:spacing w:after="0"/>
+            </w:pPr>
+            <w:r>
+              <w:rPr>
+                <w:sz w:val="17"/>
+              </w:rPr>
+              <w:t>Mensagem "Erro inesperado" e o sistema continua aberto</w:t>
+            </w:r>
+          </w:p>
+        </w:tc>
+        <w:tc>
+          <w:tcPr>
+            <w:tcW w:type="dxa" w:w="1368"/>
+          </w:tcPr>
+          <w:p>
+            <w:pPr>
+              <w:spacing w:after="0"/>
+            </w:pPr>
+            <w:r>
+              <w:rPr>
+                <w:sz w:val="17"/>
+              </w:rPr>
+              <w:t>Conforme esperado</w:t>
+            </w:r>
+          </w:p>
+        </w:tc>
+      </w:tr>
+    </w:tbl>
+    <w:p>
+      <w:pPr>
+        <w:spacing w:before="160"/>
+      </w:pPr>
+      <w:r>
+        <w:rPr/>
+        <w:t>Resultado geral: os 40 testes automáticos passaram e o roteiro executado na interface terminou sem falhas. As capturas de tela e os dados do roteiro são fictícios.</w:t>
+      </w:r>
+    </w:p>
+    <w:p>
+      <w:pPr>
+        <w:pStyle w:val="Ttulo2"/>
+      </w:pPr>
+      <w:r>
+        <w:lastRenderedPageBreak/>
+        <w:t>10. Participação dos integrantes</w:t>
+      </w:r>
+    </w:p>
+    <w:p>
+      <w:r>
+        <w:t>Danilo Lima: Programação (Python) e Testes (Etapa 1: Auxílio na definição de requisitos e regras de negócio).</w:t>
+      </w:r>
+    </w:p>
+    <w:p>
+      <w:r>
+        <w:t>Mateus Sousa: Banco de Dados e Integração (Etapa 1: Definição do modelo preliminar do banco de dados).</w:t>
+      </w:r>
+    </w:p>
+    <w:p>
+      <w:proofErr w:type="spellStart"/>
+      <w:r>
+        <w:t>Igo</w:t>
+      </w:r>
+      <w:proofErr w:type="spellEnd"/>
+      <w:r>
+        <w:t xml:space="preserve"> Araújo: Interface Gráfica e Prototipação (Etapa 1: Estruturação inicial do problema e público-alvo).</w:t>
+      </w:r>
+    </w:p>
+    <w:p>
+      <w:r>
+        <w:t>William Guilhon: Requisitos, Regras de Negócio e Documentação (Etapa 1: Consolidação do relatório e redação do escopo).</w:t>
+      </w:r>
+    </w:p>
+    <w:p>
+      <w:r>
         <w:rPr>
           <w:highlight w:val="yellow"/>
         </w:rPr>
-        <w:t>Espaço reservado: Documentar os cenários testados, resultados esperados e obtidos, incluindo o tratamento de entradas inválidas.</w:t>
-      </w:r>
-    </w:p>
-    <w:p>
-      <w:pPr>
-        <w:pStyle w:val="Ttulo2"/>
-      </w:pPr>
-      <w:r>
-        <w:lastRenderedPageBreak/>
-        <w:t>10. Participação dos integrantes</w:t>
-      </w:r>
-    </w:p>
-    <w:p>
-      <w:r>
-        <w:t>Danilo Lima: Programação (Python) e Testes (Etapa 1: Auxílio na definição de requisitos e regras de negócio).</w:t>
-      </w:r>
-    </w:p>
-    <w:p>
-      <w:r>
-        <w:t>Mateus Sousa: Banco de Dados e Integração (Etapa 1: Definição do modelo preliminar do banco de dados).</w:t>
-      </w:r>
-    </w:p>
-    <w:p>
-      <w:proofErr w:type="spellStart"/>
-      <w:r>
-        <w:t>Igo</w:t>
-      </w:r>
-      <w:proofErr w:type="spellEnd"/>
-      <w:r>
-        <w:t xml:space="preserve"> Araújo: Interface Gráfica e Prototipação (Etapa 1: Estruturação inicial do problema e público-alvo).</w:t>
-      </w:r>
-    </w:p>
-    <w:p>
-      <w:r>
-        <w:t>William Guilhon: Requisitos, Regras de Negócio e Documentação (Etapa 1: Consolidação do relatório e redação do escopo).</w:t>
+        <w:t>[PREENCHER: atividades de cada integrante nas Etapas 2 e 3 (e nas seguintes), conforme o PDF de orientações.]</w:t>
       </w:r>
     </w:p>
     <w:p>
@@ -811,28 +2534,20 @@
     </w:p>
     <w:p>
       <w:r>
-        <w:t xml:space="preserve">- Documentação oficial dos módulos sqlite3 e </w:t>
-      </w:r>
-      <w:proofErr w:type="spellStart"/>
-      <w:r>
-        <w:t>tkinter</w:t>
-      </w:r>
-      <w:proofErr w:type="spellEnd"/>
-      <w:r>
-        <w:t xml:space="preserve"> (docs.python.org).</w:t>
-      </w:r>
-    </w:p>
-    <w:p>
-      <w:r>
-        <w:t>- Ferramentas de IA: Claude (</w:t>
-      </w:r>
-      <w:proofErr w:type="spellStart"/>
-      <w:r>
-        <w:t>Anthropic</w:t>
-      </w:r>
-      <w:proofErr w:type="spellEnd"/>
-      <w:r>
-        <w:t>), utilizado como apoio na revisão do relatório.</w:t>
+        <w:rPr/>
+        <w:t>- Documentação oficial dos módulos sqlite3, tkinter, hashlib e unittest (docs.python.org).</w:t>
+      </w:r>
+    </w:p>
+    <w:p>
+      <w:r>
+        <w:rPr/>
+        <w:t>- Documentação do CustomTkinter (github.com/TomSchimansky/CustomTkinter).</w:t>
+      </w:r>
+    </w:p>
+    <w:p>
+      <w:r>
+        <w:rPr/>
+        <w:t>- Ferramentas de IA: Claude (Anthropic), utilizado como apoio na revisão do relatório, na criação da tela de login, na migração da interface para o CustomTkinter, nos testes automatizados, no tratamento de erros e na atualização do README.</w:t>
       </w:r>
     </w:p>
     <w:p>
@@ -845,10 +2560,74 @@
     </w:p>
     <w:p>
       <w:r>
+        <w:rPr/>
+        <w:t>Requisitos: Python 3.9 ou superior; Tkinter (já vem com o Python no Windows e no macOS; no Linux Debian/Ubuntu: sudo apt install python3-tk); e o CustomTkinter, listado no arquivo requirements.txt.</w:t>
+      </w:r>
+    </w:p>
+    <w:p>
+      <w:r>
+        <w:rPr/>
+        <w:t>1. Instalar as dependências (uma vez), na pasta do projeto:</w:t>
+      </w:r>
+    </w:p>
+    <w:p>
+      <w:r>
         <w:rPr>
-          <w:highlight w:val="yellow"/>
+          <w:rFonts w:ascii="Courier New" w:hAnsi="Courier New" w:eastAsia="Courier New"/>
+          <w:sz w:val="19"/>
         </w:rPr>
-        <w:t>Espaço reservado: Listar dependências, instalação, inicialização do banco e passos para rodar a aplicação.</w:t>
+        <w:t>pip install -r requirements.txt</w:t>
+      </w:r>
+    </w:p>
+    <w:p>
+      <w:r>
+        <w:rPr/>
+        <w:t>2. Iniciar o sistema (o banco é criado sozinho na primeira execução):</w:t>
+      </w:r>
+    </w:p>
+    <w:p>
+      <w:r>
+        <w:rPr>
+          <w:rFonts w:ascii="Courier New" w:hAnsi="Courier New" w:eastAsia="Courier New"/>
+          <w:sz w:val="19"/>
+        </w:rPr>
+        <w:t>python main.py</w:t>
+      </w:r>
+    </w:p>
+    <w:p>
+      <w:r>
+        <w:rPr/>
+        <w:t>3. Inicialização do banco: na primeira execução, o arquivo clinica.db é criado na pasta do projeto, com as tabelas, as especialidades iniciais e o usuário padrão admin (senha admin123). Para recomeçar do zero, feche o programa e apague o arquivo clinica.db.</w:t>
+      </w:r>
+    </w:p>
+    <w:p>
+      <w:r>
+        <w:rPr/>
+        <w:t>4. Criar outro usuário de login (ainda não há tela para isso), trocando nome, login e senha:</w:t>
+      </w:r>
+    </w:p>
+    <w:p>
+      <w:r>
+        <w:rPr>
+          <w:rFonts w:ascii="Courier New" w:hAnsi="Courier New" w:eastAsia="Courier New"/>
+          <w:sz w:val="17"/>
+        </w:rPr>
+        <w:t>python -c "import database; from services import autenticacao; database.criar_tabelas(); autenticacao.cadastrar_usuario('Maria Souza', 'maria', 'senha123')"</w:t>
+      </w:r>
+    </w:p>
+    <w:p>
+      <w:r>
+        <w:rPr/>
+        <w:t>5. Executar os testes automáticos:</w:t>
+      </w:r>
+    </w:p>
+    <w:p>
+      <w:r>
+        <w:rPr>
+          <w:rFonts w:ascii="Courier New" w:hAnsi="Courier New" w:eastAsia="Courier New"/>
+          <w:sz w:val="19"/>
+        </w:rPr>
+        <w:t>python -m unittest discover -s tests -v</w:t>
       </w:r>
     </w:p>
     <w:p/>

</xml_diff>